<commit_message>
Add mississippi content and images
</commit_message>
<xml_diff>
--- a/events/mississippi/mississippi.docx
+++ b/events/mississippi/mississippi.docx
@@ -11,12 +11,17 @@
       <w:pPr>
         <w:pStyle w:val="NoSpacing"/>
       </w:pPr>
+    </w:p>
+    <w:p>
+      <w:pPr>
+        <w:pStyle w:val="NoSpacing"/>
+      </w:pPr>
       <w:r>
         <w:drawing>
-          <wp:inline distT="0" distB="0" distL="0" distR="0" wp14:anchorId="5D4F3E41" wp14:editId="7C6E1D3E">
+          <wp:inline distT="0" distB="0" distL="0" distR="0" wp14:anchorId="594C275F" wp14:editId="0D858AFF">
             <wp:extent cx="6858000" cy="6858000"/>
             <wp:effectExtent l="0" t="0" r="0" b="0"/>
-            <wp:docPr id="616136158" name="Picture 2"/>
+            <wp:docPr id="925592119" name="Picture 2"/>
             <wp:cNvGraphicFramePr>
               <a:graphicFrameLocks xmlns:a="http://schemas.openxmlformats.org/drawingml/2006/main" noChangeAspect="1"/>
             </wp:cNvGraphicFramePr>
@@ -1038,7 +1043,7 @@
     <w:basedOn w:val="DefaultParagraphFont"/>
     <w:uiPriority w:val="99"/>
     <w:unhideWhenUsed/>
-    <w:rsid w:val="007E660D"/>
+    <w:rsid w:val="00B54771"/>
     <w:rPr>
       <w:color w:val="467886" w:themeColor="hyperlink"/>
       <w:u w:val="single"/>
@@ -1050,7 +1055,7 @@
     <w:uiPriority w:val="99"/>
     <w:semiHidden/>
     <w:unhideWhenUsed/>
-    <w:rsid w:val="007E660D"/>
+    <w:rsid w:val="00B54771"/>
     <w:rPr>
       <w:color w:val="605E5C"/>
       <w:shd w:val="clear" w:color="auto" w:fill="E1DFDD"/>

</xml_diff>